<commit_message>
Nœud chauffage SdB : circuit imprimé V 1.0 terminé
- Carte 64 × 48 mm dessinée dans EasyEDA Pro : placement, routage
  (plans GND 2 faces, 29 vias de couture), gouttes, sérigraphie ;
  contrôle des règles sans erreur, schéma et PCB identiques.
- Bornier J1 et prise J5 tournés de 180° (entrée des fils vers le bord).
- Schéma aéré (composants regroupés par fonction).
- Projet EasyEDA (.epro2), vues 2D/3D/PCB et PDF ajoutés ;
  dossier NoeudChauffageSdb.md/.docx mis à jour.

Co-Authored-By: Claude Opus 5.5 <noreply@anthropic.com>
</commit_message>
<xml_diff>
--- a/Capteur/pcb/NoeudChauffageSdb.docx
+++ b/Capteur/pcb/NoeudChauffageSdb.docx
@@ -8,7 +8,7 @@
         <w:keepNext/>
       </w:pPr>
       <w:r>
-        <w:t xml:space="preserve">NoeudChauffageSdb — Circuit imprimé (proposition de schéma)</w:t>
+        <w:t xml:space="preserve">NoeudChauffageSdb — Circuit imprimé</w:t>
       </w:r>
     </w:p>
     <w:p>
@@ -16,14 +16,17 @@
         <w:spacing w:after="120"/>
       </w:pPr>
       <w:r>
-        <w:t xml:space="preserve">Version du 2026-10-18. Dossier de conception VALIDÉ, à reprendre au moment de dessiner la carte dans EasyEDA Pro. </w:t>
+        <w:t xml:space="preserve">Version du 2026-10-18 (carte V 1.0 dessinée). </w:t>
       </w:r>
       <w:r>
         <w:rPr>
           <w:b/>
           <w:bCs/>
         </w:rPr>
-        <w:t xml:space="preserve">État : rien n'est encore créé dans EasyEDA.</w:t>
+        <w:t xml:space="preserve">État : schéma, placement, routage, gouttes et sérigraphie FAITS dans EasyEDA Pro ; contrôle des règles (DRC) = 0 erreur ; schéma et PCB identiques. Prêt pour l'export .epro2 et la commande</w:t>
+      </w:r>
+      <w:r>
+        <w:t xml:space="preserve"> (détail au § 8).</w:t>
       </w:r>
     </w:p>
     <w:p>
@@ -881,8 +884,8 @@
         </w:tblBorders>
       </w:tblPr>
       <w:tblGrid>
-        <w:gridCol w:w="1522"/>
-        <w:gridCol w:w="8116"/>
+        <w:gridCol w:w="1215"/>
+        <w:gridCol w:w="8423"/>
       </w:tblGrid>
       <w:tr>
         <w:trPr>
@@ -890,7 +893,7 @@
         </w:trPr>
         <w:tc>
           <w:tcPr>
-            <w:tcW w:type="dxa" w:w="1522"/>
+            <w:tcW w:type="dxa" w:w="1215"/>
             <w:tcBorders>
               <w:top w:val="single" w:color="999999" w:sz="4"/>
               <w:left w:val="single" w:color="999999" w:sz="4"/>
@@ -917,7 +920,7 @@
         </w:tc>
         <w:tc>
           <w:tcPr>
-            <w:tcW w:type="dxa" w:w="8116"/>
+            <w:tcW w:type="dxa" w:w="8423"/>
             <w:tcBorders>
               <w:top w:val="single" w:color="999999" w:sz="4"/>
               <w:left w:val="single" w:color="999999" w:sz="4"/>
@@ -949,7 +952,7 @@
         </w:trPr>
         <w:tc>
           <w:tcPr>
-            <w:tcW w:type="dxa" w:w="1522"/>
+            <w:tcW w:type="dxa" w:w="1215"/>
             <w:tcBorders>
               <w:top w:val="single" w:color="999999" w:sz="4"/>
               <w:left w:val="single" w:color="999999" w:sz="4"/>
@@ -971,7 +974,7 @@
         </w:tc>
         <w:tc>
           <w:tcPr>
-            <w:tcW w:type="dxa" w:w="8116"/>
+            <w:tcW w:type="dxa" w:w="8423"/>
             <w:tcBorders>
               <w:top w:val="single" w:color="999999" w:sz="4"/>
               <w:left w:val="single" w:color="999999" w:sz="4"/>
@@ -998,7 +1001,7 @@
         </w:trPr>
         <w:tc>
           <w:tcPr>
-            <w:tcW w:type="dxa" w:w="1522"/>
+            <w:tcW w:type="dxa" w:w="1215"/>
             <w:tcBorders>
               <w:top w:val="single" w:color="999999" w:sz="4"/>
               <w:left w:val="single" w:color="999999" w:sz="4"/>
@@ -1020,7 +1023,7 @@
         </w:tc>
         <w:tc>
           <w:tcPr>
-            <w:tcW w:type="dxa" w:w="8116"/>
+            <w:tcW w:type="dxa" w:w="8423"/>
             <w:tcBorders>
               <w:top w:val="single" w:color="999999" w:sz="4"/>
               <w:left w:val="single" w:color="999999" w:sz="4"/>
@@ -1047,7 +1050,7 @@
         </w:trPr>
         <w:tc>
           <w:tcPr>
-            <w:tcW w:type="dxa" w:w="1522"/>
+            <w:tcW w:type="dxa" w:w="1215"/>
             <w:tcBorders>
               <w:top w:val="single" w:color="999999" w:sz="4"/>
               <w:left w:val="single" w:color="999999" w:sz="4"/>
@@ -1069,7 +1072,7 @@
         </w:tc>
         <w:tc>
           <w:tcPr>
-            <w:tcW w:type="dxa" w:w="8116"/>
+            <w:tcW w:type="dxa" w:w="8423"/>
             <w:tcBorders>
               <w:top w:val="single" w:color="999999" w:sz="4"/>
               <w:left w:val="single" w:color="999999" w:sz="4"/>
@@ -1096,7 +1099,7 @@
         </w:trPr>
         <w:tc>
           <w:tcPr>
-            <w:tcW w:type="dxa" w:w="1522"/>
+            <w:tcW w:type="dxa" w:w="1215"/>
             <w:tcBorders>
               <w:top w:val="single" w:color="999999" w:sz="4"/>
               <w:left w:val="single" w:color="999999" w:sz="4"/>
@@ -1118,7 +1121,7 @@
         </w:tc>
         <w:tc>
           <w:tcPr>
-            <w:tcW w:type="dxa" w:w="8116"/>
+            <w:tcW w:type="dxa" w:w="8423"/>
             <w:tcBorders>
               <w:top w:val="single" w:color="999999" w:sz="4"/>
               <w:left w:val="single" w:color="999999" w:sz="4"/>
@@ -1145,7 +1148,7 @@
         </w:trPr>
         <w:tc>
           <w:tcPr>
-            <w:tcW w:type="dxa" w:w="1522"/>
+            <w:tcW w:type="dxa" w:w="1215"/>
             <w:tcBorders>
               <w:top w:val="single" w:color="999999" w:sz="4"/>
               <w:left w:val="single" w:color="999999" w:sz="4"/>
@@ -1167,7 +1170,7 @@
         </w:tc>
         <w:tc>
           <w:tcPr>
-            <w:tcW w:type="dxa" w:w="8116"/>
+            <w:tcW w:type="dxa" w:w="8423"/>
             <w:tcBorders>
               <w:top w:val="single" w:color="999999" w:sz="4"/>
               <w:left w:val="single" w:color="999999" w:sz="4"/>
@@ -1194,7 +1197,7 @@
         </w:trPr>
         <w:tc>
           <w:tcPr>
-            <w:tcW w:type="dxa" w:w="1522"/>
+            <w:tcW w:type="dxa" w:w="1215"/>
             <w:tcBorders>
               <w:top w:val="single" w:color="999999" w:sz="4"/>
               <w:left w:val="single" w:color="999999" w:sz="4"/>
@@ -1216,7 +1219,7 @@
         </w:tc>
         <w:tc>
           <w:tcPr>
-            <w:tcW w:type="dxa" w:w="8116"/>
+            <w:tcW w:type="dxa" w:w="8423"/>
             <w:tcBorders>
               <w:top w:val="single" w:color="999999" w:sz="4"/>
               <w:left w:val="single" w:color="999999" w:sz="4"/>
@@ -1243,7 +1246,7 @@
         </w:trPr>
         <w:tc>
           <w:tcPr>
-            <w:tcW w:type="dxa" w:w="1522"/>
+            <w:tcW w:type="dxa" w:w="1215"/>
             <w:tcBorders>
               <w:top w:val="single" w:color="999999" w:sz="4"/>
               <w:left w:val="single" w:color="999999" w:sz="4"/>
@@ -1265,7 +1268,7 @@
         </w:tc>
         <w:tc>
           <w:tcPr>
-            <w:tcW w:type="dxa" w:w="8116"/>
+            <w:tcW w:type="dxa" w:w="8423"/>
             <w:tcBorders>
               <w:top w:val="single" w:color="999999" w:sz="4"/>
               <w:left w:val="single" w:color="999999" w:sz="4"/>
@@ -1292,7 +1295,7 @@
         </w:trPr>
         <w:tc>
           <w:tcPr>
-            <w:tcW w:type="dxa" w:w="1522"/>
+            <w:tcW w:type="dxa" w:w="1215"/>
             <w:tcBorders>
               <w:top w:val="single" w:color="999999" w:sz="4"/>
               <w:left w:val="single" w:color="999999" w:sz="4"/>
@@ -1314,23 +1317,30 @@
         </w:tc>
         <w:tc>
           <w:tcPr>
-            <w:tcW w:type="dxa" w:w="8116"/>
-            <w:tcBorders>
-              <w:top w:val="single" w:color="999999" w:sz="4"/>
-              <w:left w:val="single" w:color="999999" w:sz="4"/>
-              <w:bottom w:val="single" w:color="999999" w:sz="4"/>
-              <w:right w:val="single" w:color="999999" w:sz="4"/>
-            </w:tcBorders>
-            <w:tcMar>
-              <w:top w:type="dxa" w:w="60"/>
-              <w:left w:type="dxa" w:w="100"/>
-              <w:bottom w:type="dxa" w:w="60"/>
-              <w:right w:type="dxa" w:w="100"/>
-            </w:tcMar>
-          </w:tcPr>
-          <w:p>
-            <w:r>
-              <w:t xml:space="preserve">Hammond 1554C2GYCL (IP66, couvercle transparent) ; entrées par presse-étoupes</w:t>
+            <w:tcW w:type="dxa" w:w="8423"/>
+            <w:tcBorders>
+              <w:top w:val="single" w:color="999999" w:sz="4"/>
+              <w:left w:val="single" w:color="999999" w:sz="4"/>
+              <w:bottom w:val="single" w:color="999999" w:sz="4"/>
+              <w:right w:val="single" w:color="999999" w:sz="4"/>
+            </w:tcBorders>
+            <w:tcMar>
+              <w:top w:type="dxa" w:w="60"/>
+              <w:left w:type="dxa" w:w="100"/>
+              <w:bottom w:type="dxa" w:w="60"/>
+              <w:right w:type="dxa" w:w="100"/>
+            </w:tcMar>
+          </w:tcPr>
+          <w:p>
+            <w:r>
+              <w:rPr>
+                <w:b/>
+                <w:bCs/>
+              </w:rPr>
+              <w:t xml:space="preserve">impression 3D</w:t>
+            </w:r>
+            <w:r>
+              <w:t xml:space="preserve"> pour le premier essai (carte au plus juste) ; Hammond 1554C2GYCL gardé en option (§ 6)</w:t>
             </w:r>
           </w:p>
         </w:tc>
@@ -1341,7 +1351,7 @@
         </w:trPr>
         <w:tc>
           <w:tcPr>
-            <w:tcW w:type="dxa" w:w="1522"/>
+            <w:tcW w:type="dxa" w:w="1215"/>
             <w:tcBorders>
               <w:top w:val="single" w:color="999999" w:sz="4"/>
               <w:left w:val="single" w:color="999999" w:sz="4"/>
@@ -1363,7 +1373,7 @@
         </w:tc>
         <w:tc>
           <w:tcPr>
-            <w:tcW w:type="dxa" w:w="8116"/>
+            <w:tcW w:type="dxa" w:w="8423"/>
             <w:tcBorders>
               <w:top w:val="single" w:color="999999" w:sz="4"/>
               <w:left w:val="single" w:color="999999" w:sz="4"/>
@@ -5869,6 +5879,24 @@
           <w:b/>
           <w:bCs/>
         </w:rPr>
+        <w:t xml:space="preserve">Décision pour le premier essai : boîtier imprimé en 3D</w:t>
+      </w:r>
+      <w:r>
+        <w:t xml:space="preserve">, dessiné autour de la carte (64 × 48 mm, 4 trous M3 à 3,5 mm des coins, § 8.2). Le micro et les LED IR restent dehors, sur fil ; les LED témoins doivent rester visibles (fenêtre ou couvercle translucide à prévoir au tracé du boîtier).</w:t>
+      </w:r>
+    </w:p>
+    <w:p>
+      <w:pPr>
+        <w:spacing w:after="120"/>
+      </w:pPr>
+      <w:r>
+        <w:t xml:space="preserve">Option gardée pour plus tard, </w:t>
+      </w:r>
+      <w:r>
+        <w:rPr>
+          <w:b/>
+          <w:bCs/>
+        </w:rPr>
         <w:t xml:space="preserve">Hammond 1554C2GYCL</w:t>
       </w:r>
       <w:r>
@@ -6536,7 +6564,522 @@
         <w:keepNext/>
       </w:pPr>
       <w:r>
-        <w:t xml:space="preserve">8. À faire au moment de la conception</w:t>
+        <w:t xml:space="preserve">8. Circuit imprimé réalisé (EasyEDA Pro)</w:t>
+      </w:r>
+    </w:p>
+    <w:p>
+      <w:pPr>
+        <w:pStyle w:val="Heading2"/>
+        <w:keepNext/>
+      </w:pPr>
+      <w:r>
+        <w:t xml:space="preserve">8.1 Projet</w:t>
+      </w:r>
+    </w:p>
+    <w:tbl>
+      <w:tblPr>
+        <w:tblW w:type="dxa" w:w="9638"/>
+        <w:tblBorders>
+          <w:top w:val="single" w:color="auto" w:sz="4"/>
+          <w:left w:val="single" w:color="auto" w:sz="4"/>
+          <w:bottom w:val="single" w:color="auto" w:sz="4"/>
+          <w:right w:val="single" w:color="auto" w:sz="4"/>
+          <w:insideH w:val="single" w:color="auto" w:sz="4"/>
+          <w:insideV w:val="single" w:color="auto" w:sz="4"/>
+        </w:tblBorders>
+      </w:tblPr>
+      <w:tblGrid>
+        <w:gridCol w:w="452"/>
+        <w:gridCol w:w="9186"/>
+      </w:tblGrid>
+      <w:tr>
+        <w:trPr>
+          <w:tblHeader/>
+        </w:trPr>
+        <w:tc>
+          <w:tcPr>
+            <w:tcW w:type="dxa" w:w="452"/>
+            <w:tcBorders>
+              <w:top w:val="single" w:color="999999" w:sz="4"/>
+              <w:left w:val="single" w:color="999999" w:sz="4"/>
+              <w:bottom w:val="single" w:color="999999" w:sz="4"/>
+              <w:right w:val="single" w:color="999999" w:sz="4"/>
+            </w:tcBorders>
+            <w:shd w:fill="D9E2F3" w:val="clear"/>
+            <w:tcMar>
+              <w:top w:type="dxa" w:w="60"/>
+              <w:left w:type="dxa" w:w="100"/>
+              <w:bottom w:type="dxa" w:w="60"/>
+              <w:right w:type="dxa" w:w="100"/>
+            </w:tcMar>
+          </w:tcPr>
+          <w:p>
+            <w:r>
+              <w:rPr>
+                <w:b/>
+                <w:bCs/>
+              </w:rPr>
+              <w:t xml:space="preserve">Élément</w:t>
+            </w:r>
+          </w:p>
+        </w:tc>
+        <w:tc>
+          <w:tcPr>
+            <w:tcW w:type="dxa" w:w="9186"/>
+            <w:tcBorders>
+              <w:top w:val="single" w:color="999999" w:sz="4"/>
+              <w:left w:val="single" w:color="999999" w:sz="4"/>
+              <w:bottom w:val="single" w:color="999999" w:sz="4"/>
+              <w:right w:val="single" w:color="999999" w:sz="4"/>
+            </w:tcBorders>
+            <w:shd w:fill="D9E2F3" w:val="clear"/>
+            <w:tcMar>
+              <w:top w:type="dxa" w:w="60"/>
+              <w:left w:type="dxa" w:w="100"/>
+              <w:bottom w:type="dxa" w:w="60"/>
+              <w:right w:type="dxa" w:w="100"/>
+            </w:tcMar>
+          </w:tcPr>
+          <w:p>
+            <w:r>
+              <w:rPr>
+                <w:b/>
+                <w:bCs/>
+              </w:rPr>
+              <w:t xml:space="preserve">Valeur</w:t>
+            </w:r>
+          </w:p>
+        </w:tc>
+      </w:tr>
+      <w:tr>
+        <w:trPr>
+          <w:tblHeader w:val="off"/>
+        </w:trPr>
+        <w:tc>
+          <w:tcPr>
+            <w:tcW w:type="dxa" w:w="452"/>
+            <w:tcBorders>
+              <w:top w:val="single" w:color="999999" w:sz="4"/>
+              <w:left w:val="single" w:color="999999" w:sz="4"/>
+              <w:bottom w:val="single" w:color="999999" w:sz="4"/>
+              <w:right w:val="single" w:color="999999" w:sz="4"/>
+            </w:tcBorders>
+            <w:tcMar>
+              <w:top w:type="dxa" w:w="60"/>
+              <w:left w:type="dxa" w:w="100"/>
+              <w:bottom w:type="dxa" w:w="60"/>
+              <w:right w:type="dxa" w:w="100"/>
+            </w:tcMar>
+          </w:tcPr>
+          <w:p>
+            <w:r>
+              <w:t xml:space="preserve">Projet</w:t>
+            </w:r>
+          </w:p>
+        </w:tc>
+        <w:tc>
+          <w:tcPr>
+            <w:tcW w:type="dxa" w:w="9186"/>
+            <w:tcBorders>
+              <w:top w:val="single" w:color="999999" w:sz="4"/>
+              <w:left w:val="single" w:color="999999" w:sz="4"/>
+              <w:bottom w:val="single" w:color="999999" w:sz="4"/>
+              <w:right w:val="single" w:color="999999" w:sz="4"/>
+            </w:tcBorders>
+            <w:tcMar>
+              <w:top w:type="dxa" w:w="60"/>
+              <w:left w:type="dxa" w:w="100"/>
+              <w:bottom w:type="dxa" w:w="60"/>
+              <w:right w:type="dxa" w:w="100"/>
+            </w:tcMar>
+          </w:tcPr>
+          <w:p>
+            <w:r>
+              <w:t xml:space="preserve">cloud (Online Mode) « NoeudChauffageSdb » ; sauvegarde locale : </w:t>
+            </w:r>
+            <w:r>
+              <w:rPr>
+                <w:rFonts w:ascii="Consolas" w:cs="Consolas" w:eastAsia="Consolas" w:hAnsi="Consolas"/>
+                <w:sz w:val="19"/>
+                <w:szCs w:val="19"/>
+              </w:rPr>
+              <w:t xml:space="preserve">pcb/NoeudChauffageSdb.epro2</w:t>
+            </w:r>
+          </w:p>
+        </w:tc>
+      </w:tr>
+      <w:tr>
+        <w:trPr>
+          <w:tblHeader w:val="off"/>
+        </w:trPr>
+        <w:tc>
+          <w:tcPr>
+            <w:tcW w:type="dxa" w:w="452"/>
+            <w:tcBorders>
+              <w:top w:val="single" w:color="999999" w:sz="4"/>
+              <w:left w:val="single" w:color="999999" w:sz="4"/>
+              <w:bottom w:val="single" w:color="999999" w:sz="4"/>
+              <w:right w:val="single" w:color="999999" w:sz="4"/>
+            </w:tcBorders>
+            <w:tcMar>
+              <w:top w:type="dxa" w:w="60"/>
+              <w:left w:type="dxa" w:w="100"/>
+              <w:bottom w:type="dxa" w:w="60"/>
+              <w:right w:type="dxa" w:w="100"/>
+            </w:tcMar>
+          </w:tcPr>
+          <w:p>
+            <w:r>
+              <w:t xml:space="preserve">Schéma</w:t>
+            </w:r>
+          </w:p>
+        </w:tc>
+        <w:tc>
+          <w:tcPr>
+            <w:tcW w:type="dxa" w:w="9186"/>
+            <w:tcBorders>
+              <w:top w:val="single" w:color="999999" w:sz="4"/>
+              <w:left w:val="single" w:color="999999" w:sz="4"/>
+              <w:bottom w:val="single" w:color="999999" w:sz="4"/>
+              <w:right w:val="single" w:color="999999" w:sz="4"/>
+            </w:tcBorders>
+            <w:tcMar>
+              <w:top w:type="dxa" w:w="60"/>
+              <w:left w:type="dxa" w:w="100"/>
+              <w:bottom w:type="dxa" w:w="60"/>
+              <w:right w:type="dxa" w:w="100"/>
+            </w:tcMar>
+          </w:tcPr>
+          <w:p>
+            <w:r>
+              <w:t xml:space="preserve">« NoeudChauffageSdb », 3 pages : Alimentation, Carte, Périphériques ; 29 composants, 16 réseaux, 60 liaisons ; pages aérées (composants regroupés par fonction, dans le sens du signal)</w:t>
+            </w:r>
+          </w:p>
+        </w:tc>
+      </w:tr>
+      <w:tr>
+        <w:trPr>
+          <w:tblHeader w:val="off"/>
+        </w:trPr>
+        <w:tc>
+          <w:tcPr>
+            <w:tcW w:type="dxa" w:w="452"/>
+            <w:tcBorders>
+              <w:top w:val="single" w:color="999999" w:sz="4"/>
+              <w:left w:val="single" w:color="999999" w:sz="4"/>
+              <w:bottom w:val="single" w:color="999999" w:sz="4"/>
+              <w:right w:val="single" w:color="999999" w:sz="4"/>
+            </w:tcBorders>
+            <w:tcMar>
+              <w:top w:type="dxa" w:w="60"/>
+              <w:left w:type="dxa" w:w="100"/>
+              <w:bottom w:type="dxa" w:w="60"/>
+              <w:right w:type="dxa" w:w="100"/>
+            </w:tcMar>
+          </w:tcPr>
+          <w:p>
+            <w:r>
+              <w:t xml:space="preserve">Exports</w:t>
+            </w:r>
+          </w:p>
+        </w:tc>
+        <w:tc>
+          <w:tcPr>
+            <w:tcW w:type="dxa" w:w="9186"/>
+            <w:tcBorders>
+              <w:top w:val="single" w:color="999999" w:sz="4"/>
+              <w:left w:val="single" w:color="999999" w:sz="4"/>
+              <w:bottom w:val="single" w:color="999999" w:sz="4"/>
+              <w:right w:val="single" w:color="999999" w:sz="4"/>
+            </w:tcBorders>
+            <w:tcMar>
+              <w:top w:type="dxa" w:w="60"/>
+              <w:left w:type="dxa" w:w="100"/>
+              <w:bottom w:type="dxa" w:w="60"/>
+              <w:right w:type="dxa" w:w="100"/>
+            </w:tcMar>
+          </w:tcPr>
+          <w:p>
+            <w:r>
+              <w:rPr>
+                <w:rFonts w:ascii="Consolas" w:cs="Consolas" w:eastAsia="Consolas" w:hAnsi="Consolas"/>
+                <w:sz w:val="19"/>
+                <w:szCs w:val="19"/>
+              </w:rPr>
+              <w:t xml:space="preserve">pcb/</w:t>
+            </w:r>
+            <w:r>
+              <w:t xml:space="preserve"> : 2D_PCB_…png, 3D_PCB_…png, PCB_PCB_…png (vues de la carte), PDF_…zip (schéma et PCB en PDF)</w:t>
+            </w:r>
+          </w:p>
+        </w:tc>
+      </w:tr>
+      <w:tr>
+        <w:trPr>
+          <w:tblHeader w:val="off"/>
+        </w:trPr>
+        <w:tc>
+          <w:tcPr>
+            <w:tcW w:type="dxa" w:w="452"/>
+            <w:tcBorders>
+              <w:top w:val="single" w:color="999999" w:sz="4"/>
+              <w:left w:val="single" w:color="999999" w:sz="4"/>
+              <w:bottom w:val="single" w:color="999999" w:sz="4"/>
+              <w:right w:val="single" w:color="999999" w:sz="4"/>
+            </w:tcBorders>
+            <w:tcMar>
+              <w:top w:type="dxa" w:w="60"/>
+              <w:left w:type="dxa" w:w="100"/>
+              <w:bottom w:type="dxa" w:w="60"/>
+              <w:right w:type="dxa" w:w="100"/>
+            </w:tcMar>
+          </w:tcPr>
+          <w:p>
+            <w:r>
+              <w:t xml:space="preserve">Règles</w:t>
+            </w:r>
+          </w:p>
+        </w:tc>
+        <w:tc>
+          <w:tcPr>
+            <w:tcW w:type="dxa" w:w="9186"/>
+            <w:tcBorders>
+              <w:top w:val="single" w:color="999999" w:sz="4"/>
+              <w:left w:val="single" w:color="999999" w:sz="4"/>
+              <w:bottom w:val="single" w:color="999999" w:sz="4"/>
+              <w:right w:val="single" w:color="999999" w:sz="4"/>
+            </w:tcBorders>
+            <w:tcMar>
+              <w:top w:type="dxa" w:w="60"/>
+              <w:left w:type="dxa" w:w="100"/>
+              <w:bottom w:type="dxa" w:w="60"/>
+              <w:right w:type="dxa" w:w="100"/>
+            </w:tcMar>
+          </w:tcPr>
+          <w:p>
+            <w:r>
+              <w:t xml:space="preserve">« THT soudure main JLCPCB » (notice du modèle de règles)</w:t>
+            </w:r>
+          </w:p>
+        </w:tc>
+      </w:tr>
+      <w:tr>
+        <w:trPr>
+          <w:tblHeader w:val="off"/>
+        </w:trPr>
+        <w:tc>
+          <w:tcPr>
+            <w:tcW w:type="dxa" w:w="452"/>
+            <w:tcBorders>
+              <w:top w:val="single" w:color="999999" w:sz="4"/>
+              <w:left w:val="single" w:color="999999" w:sz="4"/>
+              <w:bottom w:val="single" w:color="999999" w:sz="4"/>
+              <w:right w:val="single" w:color="999999" w:sz="4"/>
+            </w:tcBorders>
+            <w:tcMar>
+              <w:top w:type="dxa" w:w="60"/>
+              <w:left w:type="dxa" w:w="100"/>
+              <w:bottom w:type="dxa" w:w="60"/>
+              <w:right w:type="dxa" w:w="100"/>
+            </w:tcMar>
+          </w:tcPr>
+          <w:p>
+            <w:r>
+              <w:t xml:space="preserve">Classes</w:t>
+            </w:r>
+          </w:p>
+        </w:tc>
+        <w:tc>
+          <w:tcPr>
+            <w:tcW w:type="dxa" w:w="9186"/>
+            <w:tcBorders>
+              <w:top w:val="single" w:color="999999" w:sz="4"/>
+              <w:left w:val="single" w:color="999999" w:sz="4"/>
+              <w:bottom w:val="single" w:color="999999" w:sz="4"/>
+              <w:right w:val="single" w:color="999999" w:sz="4"/>
+            </w:tcBorders>
+            <w:tcMar>
+              <w:top w:type="dxa" w:w="60"/>
+              <w:left w:type="dxa" w:w="100"/>
+              <w:bottom w:type="dxa" w:w="60"/>
+              <w:right w:type="dxa" w:w="100"/>
+            </w:tcMar>
+          </w:tcPr>
+          <w:p>
+            <w:r>
+              <w:t xml:space="preserve">PUISSANCE 1,0 mm (</w:t>
+            </w:r>
+            <w:r>
+              <w:rPr>
+                <w:rFonts w:ascii="Consolas" w:cs="Consolas" w:eastAsia="Consolas" w:hAnsi="Consolas"/>
+                <w:sz w:val="19"/>
+                <w:szCs w:val="19"/>
+              </w:rPr>
+              <w:t xml:space="preserve">V12_J</w:t>
+            </w:r>
+            <w:r>
+              <w:t xml:space="preserve">, </w:t>
+            </w:r>
+            <w:r>
+              <w:rPr>
+                <w:rFonts w:ascii="Consolas" w:cs="Consolas" w:eastAsia="Consolas" w:hAnsi="Consolas"/>
+                <w:sz w:val="19"/>
+                <w:szCs w:val="19"/>
+              </w:rPr>
+              <w:t xml:space="preserve">V12</w:t>
+            </w:r>
+            <w:r>
+              <w:t xml:space="preserve">, </w:t>
+            </w:r>
+            <w:r>
+              <w:rPr>
+                <w:rFonts w:ascii="Consolas" w:cs="Consolas" w:eastAsia="Consolas" w:hAnsi="Consolas"/>
+                <w:sz w:val="19"/>
+                <w:szCs w:val="19"/>
+              </w:rPr>
+              <w:t xml:space="preserve">5V_REG</w:t>
+            </w:r>
+            <w:r>
+              <w:t xml:space="preserve">, </w:t>
+            </w:r>
+            <w:r>
+              <w:rPr>
+                <w:rFonts w:ascii="Consolas" w:cs="Consolas" w:eastAsia="Consolas" w:hAnsi="Consolas"/>
+                <w:sz w:val="19"/>
+                <w:szCs w:val="19"/>
+              </w:rPr>
+              <w:t xml:space="preserve">+5V</w:t>
+            </w:r>
+            <w:r>
+              <w:t xml:space="preserve">, </w:t>
+            </w:r>
+            <w:r>
+              <w:rPr>
+                <w:rFonts w:ascii="Consolas" w:cs="Consolas" w:eastAsia="Consolas" w:hAnsi="Consolas"/>
+                <w:sz w:val="19"/>
+                <w:szCs w:val="19"/>
+              </w:rPr>
+              <w:t xml:space="preserve">5V_CARTE</w:t>
+            </w:r>
+            <w:r>
+              <w:t xml:space="preserve">, </w:t>
+            </w:r>
+            <w:r>
+              <w:rPr>
+                <w:rFonts w:ascii="Consolas" w:cs="Consolas" w:eastAsia="Consolas" w:hAnsi="Consolas"/>
+                <w:sz w:val="19"/>
+                <w:szCs w:val="19"/>
+              </w:rPr>
+              <w:t xml:space="preserve">GND</w:t>
+            </w:r>
+            <w:r>
+              <w:t xml:space="preserve">, </w:t>
+            </w:r>
+            <w:r>
+              <w:rPr>
+                <w:rFonts w:ascii="Consolas" w:cs="Consolas" w:eastAsia="Consolas" w:hAnsi="Consolas"/>
+                <w:sz w:val="19"/>
+                <w:szCs w:val="19"/>
+              </w:rPr>
+              <w:t xml:space="preserve">IR_V</w:t>
+            </w:r>
+            <w:r>
+              <w:t xml:space="preserve">, </w:t>
+            </w:r>
+            <w:r>
+              <w:rPr>
+                <w:rFonts w:ascii="Consolas" w:cs="Consolas" w:eastAsia="Consolas" w:hAnsi="Consolas"/>
+                <w:sz w:val="19"/>
+                <w:szCs w:val="19"/>
+              </w:rPr>
+              <w:t xml:space="preserve">IR_A</w:t>
+            </w:r>
+            <w:r>
+              <w:t xml:space="preserve">, </w:t>
+            </w:r>
+            <w:r>
+              <w:rPr>
+                <w:rFonts w:ascii="Consolas" w:cs="Consolas" w:eastAsia="Consolas" w:hAnsi="Consolas"/>
+                <w:sz w:val="19"/>
+                <w:szCs w:val="19"/>
+              </w:rPr>
+              <w:t xml:space="preserve">IR_K</w:t>
+            </w:r>
+            <w:r>
+              <w:t xml:space="preserve">) ; ALIM_3V3 0,6 mm (</w:t>
+            </w:r>
+            <w:r>
+              <w:rPr>
+                <w:rFonts w:ascii="Consolas" w:cs="Consolas" w:eastAsia="Consolas" w:hAnsi="Consolas"/>
+                <w:sz w:val="19"/>
+                <w:szCs w:val="19"/>
+              </w:rPr>
+              <w:t xml:space="preserve">3V3</w:t>
+            </w:r>
+            <w:r>
+              <w:t xml:space="preserve">) ; signaux 0,4 mm</w:t>
+            </w:r>
+          </w:p>
+        </w:tc>
+      </w:tr>
+      <w:tr>
+        <w:trPr>
+          <w:tblHeader w:val="off"/>
+        </w:trPr>
+        <w:tc>
+          <w:tcPr>
+            <w:tcW w:type="dxa" w:w="452"/>
+            <w:tcBorders>
+              <w:top w:val="single" w:color="999999" w:sz="4"/>
+              <w:left w:val="single" w:color="999999" w:sz="4"/>
+              <w:bottom w:val="single" w:color="999999" w:sz="4"/>
+              <w:right w:val="single" w:color="999999" w:sz="4"/>
+            </w:tcBorders>
+            <w:tcMar>
+              <w:top w:type="dxa" w:w="60"/>
+              <w:left w:type="dxa" w:w="100"/>
+              <w:bottom w:type="dxa" w:w="60"/>
+              <w:right w:type="dxa" w:w="100"/>
+            </w:tcMar>
+          </w:tcPr>
+          <w:p>
+            <w:r>
+              <w:t xml:space="preserve">Couronnes</w:t>
+            </w:r>
+          </w:p>
+        </w:tc>
+        <w:tc>
+          <w:tcPr>
+            <w:tcW w:type="dxa" w:w="9186"/>
+            <w:tcBorders>
+              <w:top w:val="single" w:color="999999" w:sz="4"/>
+              <w:left w:val="single" w:color="999999" w:sz="4"/>
+              <w:bottom w:val="single" w:color="999999" w:sz="4"/>
+              <w:right w:val="single" w:color="999999" w:sz="4"/>
+            </w:tcBorders>
+            <w:tcMar>
+              <w:top w:type="dxa" w:w="60"/>
+              <w:left w:type="dxa" w:w="100"/>
+              <w:bottom w:type="dxa" w:w="60"/>
+              <w:right w:type="dxa" w:w="100"/>
+            </w:tcMar>
+          </w:tcPr>
+          <w:p>
+            <w:r>
+              <w:t xml:space="preserve">≥ 0,4 mm partout (fiches personnelles du § 8.5), pastilles THT 1,8 mm sur les composants courants</w:t>
+            </w:r>
+          </w:p>
+        </w:tc>
+      </w:tr>
+    </w:tbl>
+    <w:p/>
+    <w:p>
+      <w:pPr>
+        <w:pStyle w:val="Heading2"/>
+        <w:keepNext/>
+      </w:pPr>
+      <w:r>
+        <w:t xml:space="preserve">8.2 Carte et placement</w:t>
       </w:r>
     </w:p>
     <w:p>
@@ -6548,17 +7091,24 @@
         </w:numPr>
       </w:pPr>
       <w:r>
-        <w:t xml:space="preserve">☐ Fiche perso </w:t>
-      </w:r>
-      <w:r>
         <w:rPr>
           <w:b/>
           <w:bCs/>
         </w:rPr>
-        <w:t xml:space="preserve">TO-92 au pas de 2,54 mm</w:t>
-      </w:r>
-      <w:r>
-        <w:t xml:space="preserve"> (pattes écartées) pour Q1 : l'empreinte LCSC du 2N2222A est au pas de 1,27 mm, serrée pour la soudure à la main (à valider).</w:t>
+        <w:t xml:space="preserve">64 × 48 mm</w:t>
+      </w:r>
+      <w:r>
+        <w:t xml:space="preserve">, 2 couches ; </w:t>
+      </w:r>
+      <w:r>
+        <w:rPr>
+          <w:b/>
+          <w:bCs/>
+        </w:rPr>
+        <w:t xml:space="preserve">4 trous de fixation M3</w:t>
+      </w:r>
+      <w:r>
+        <w:t xml:space="preserve"> non métallisés (Ø 3,2 mm) à 3,5 mm de chaque coin.</w:t>
       </w:r>
     </w:p>
     <w:p>
@@ -6570,17 +7120,46 @@
         </w:numPr>
       </w:pPr>
       <w:r>
-        <w:t xml:space="preserve">☐ Fiche perso </w:t>
-      </w:r>
-      <w:r>
         <w:rPr>
           <w:b/>
           <w:bCs/>
         </w:rPr>
-        <w:t xml:space="preserve">bornier XY301V agrandi</w:t>
-      </w:r>
-      <w:r>
-        <w:t xml:space="preserve"> (couronne 0,40 → ≥ 0,5 mm).</w:t>
+        <w:t xml:space="preserve">Bord bas</w:t>
+      </w:r>
+      <w:r>
+        <w:t xml:space="preserve"> : tout ce qui part sur fil ou se mesure à la pince : J1 (12 V), J6 (LED IR), J5 (micro), points de test </w:t>
+      </w:r>
+      <w:r>
+        <w:rPr>
+          <w:rFonts w:ascii="Consolas" w:cs="Consolas" w:eastAsia="Consolas" w:hAnsi="Consolas"/>
+          <w:sz w:val="19"/>
+          <w:szCs w:val="19"/>
+        </w:rPr>
+        <w:t xml:space="preserve">MICRO</w:t>
+      </w:r>
+      <w:r>
+        <w:t xml:space="preserve"> et </w:t>
+      </w:r>
+      <w:r>
+        <w:rPr>
+          <w:rFonts w:ascii="Consolas" w:cs="Consolas" w:eastAsia="Consolas" w:hAnsi="Consolas"/>
+          <w:sz w:val="19"/>
+          <w:szCs w:val="19"/>
+        </w:rPr>
+        <w:t xml:space="preserve">GND</w:t>
+      </w:r>
+      <w:r>
+        <w:t xml:space="preserve">. Le bornier J1 et la prise J5 sont tournés de 180° pour que </w:t>
+      </w:r>
+      <w:r>
+        <w:rPr>
+          <w:b/>
+          <w:bCs/>
+        </w:rPr>
+        <w:t xml:space="preserve">l'entrée des fils soit tournée vers le bord</w:t>
+      </w:r>
+      <w:r>
+        <w:t xml:space="preserve"> : sur J1, le + est à droite et le − à gauche ; sur J5, de gauche à droite : MICRO, GND, 3V3.</w:t>
       </w:r>
     </w:p>
     <w:p>
@@ -6592,7 +7171,14 @@
         </w:numPr>
       </w:pPr>
       <w:r>
-        <w:t xml:space="preserve">☐ Contrôle des couronnes de toutes les empreintes à la pose (notice du modèle, § 6).</w:t>
+        <w:rPr>
+          <w:b/>
+          <w:bCs/>
+        </w:rPr>
+        <w:t xml:space="preserve">Bord droit</w:t>
+      </w:r>
+      <w:r>
+        <w:t xml:space="preserve"> : prise USB-C du XIAO, accessible pour le reflashage.</w:t>
       </w:r>
     </w:p>
     <w:p>
@@ -6604,7 +7190,14 @@
         </w:numPr>
       </w:pPr>
       <w:r>
-        <w:t xml:space="preserve">☐ Entraxe des inserts Hammond (§ 6).</w:t>
+        <w:rPr>
+          <w:b/>
+          <w:bCs/>
+        </w:rPr>
+        <w:t xml:space="preserve">Bord haut</w:t>
+      </w:r>
+      <w:r>
+        <w:t xml:space="preserve"> : LED témoins D6 (bleue, son) et D7 (rouge, IR).</w:t>
       </w:r>
     </w:p>
     <w:p>
@@ -6616,7 +7209,1234 @@
         </w:numPr>
       </w:pPr>
       <w:r>
-        <w:t xml:space="preserve">☐ Projet EasyEDA en Online Mode, règles « THT soudure main JLCPCB », classes PUISSANCE (</w:t>
+        <w:t xml:space="preserve">Alimentation à gauche (J1 → D1 → C1 → U1 → JP1), émission IR au centre (JP2, R3, C10, Q1, R1, R2), XIAO à droite.</w:t>
+      </w:r>
+    </w:p>
+    <w:p>
+      <w:pPr>
+        <w:pStyle w:val="ListParagraph"/>
+        <w:numPr>
+          <w:ilvl w:val="0"/>
+          <w:numId w:val="2"/>
+        </w:numPr>
+      </w:pPr>
+      <w:r>
+        <w:t xml:space="preserve">Modèles 3D vérifiés (XIAO tourné de −90°, composants posés à plat sur la carte).</w:t>
+      </w:r>
+    </w:p>
+    <w:p>
+      <w:pPr>
+        <w:pStyle w:val="Heading2"/>
+        <w:keepNext/>
+      </w:pPr>
+      <w:r>
+        <w:t xml:space="preserve">8.3 Routage</w:t>
+      </w:r>
+    </w:p>
+    <w:tbl>
+      <w:tblPr>
+        <w:tblW w:type="dxa" w:w="9638"/>
+        <w:tblBorders>
+          <w:top w:val="single" w:color="auto" w:sz="4"/>
+          <w:left w:val="single" w:color="auto" w:sz="4"/>
+          <w:bottom w:val="single" w:color="auto" w:sz="4"/>
+          <w:right w:val="single" w:color="auto" w:sz="4"/>
+          <w:insideH w:val="single" w:color="auto" w:sz="4"/>
+          <w:insideV w:val="single" w:color="auto" w:sz="4"/>
+        </w:tblBorders>
+      </w:tblPr>
+      <w:tblGrid>
+        <w:gridCol w:w="1308"/>
+        <w:gridCol w:w="8330"/>
+      </w:tblGrid>
+      <w:tr>
+        <w:trPr>
+          <w:tblHeader/>
+        </w:trPr>
+        <w:tc>
+          <w:tcPr>
+            <w:tcW w:type="dxa" w:w="1308"/>
+            <w:tcBorders>
+              <w:top w:val="single" w:color="999999" w:sz="4"/>
+              <w:left w:val="single" w:color="999999" w:sz="4"/>
+              <w:bottom w:val="single" w:color="999999" w:sz="4"/>
+              <w:right w:val="single" w:color="999999" w:sz="4"/>
+            </w:tcBorders>
+            <w:shd w:fill="D9E2F3" w:val="clear"/>
+            <w:tcMar>
+              <w:top w:type="dxa" w:w="60"/>
+              <w:left w:type="dxa" w:w="100"/>
+              <w:bottom w:type="dxa" w:w="60"/>
+              <w:right w:type="dxa" w:w="100"/>
+            </w:tcMar>
+          </w:tcPr>
+          <w:p>
+            <w:r>
+              <w:rPr>
+                <w:b/>
+                <w:bCs/>
+              </w:rPr>
+              <w:t xml:space="preserve">Élément</w:t>
+            </w:r>
+          </w:p>
+        </w:tc>
+        <w:tc>
+          <w:tcPr>
+            <w:tcW w:type="dxa" w:w="8330"/>
+            <w:tcBorders>
+              <w:top w:val="single" w:color="999999" w:sz="4"/>
+              <w:left w:val="single" w:color="999999" w:sz="4"/>
+              <w:bottom w:val="single" w:color="999999" w:sz="4"/>
+              <w:right w:val="single" w:color="999999" w:sz="4"/>
+            </w:tcBorders>
+            <w:shd w:fill="D9E2F3" w:val="clear"/>
+            <w:tcMar>
+              <w:top w:type="dxa" w:w="60"/>
+              <w:left w:type="dxa" w:w="100"/>
+              <w:bottom w:type="dxa" w:w="60"/>
+              <w:right w:type="dxa" w:w="100"/>
+            </w:tcMar>
+          </w:tcPr>
+          <w:p>
+            <w:r>
+              <w:rPr>
+                <w:b/>
+                <w:bCs/>
+              </w:rPr>
+              <w:t xml:space="preserve">Réalisé</w:t>
+            </w:r>
+          </w:p>
+        </w:tc>
+      </w:tr>
+      <w:tr>
+        <w:trPr>
+          <w:tblHeader w:val="off"/>
+        </w:trPr>
+        <w:tc>
+          <w:tcPr>
+            <w:tcW w:type="dxa" w:w="1308"/>
+            <w:tcBorders>
+              <w:top w:val="single" w:color="999999" w:sz="4"/>
+              <w:left w:val="single" w:color="999999" w:sz="4"/>
+              <w:bottom w:val="single" w:color="999999" w:sz="4"/>
+              <w:right w:val="single" w:color="999999" w:sz="4"/>
+            </w:tcBorders>
+            <w:tcMar>
+              <w:top w:type="dxa" w:w="60"/>
+              <w:left w:type="dxa" w:w="100"/>
+              <w:bottom w:type="dxa" w:w="60"/>
+              <w:right w:type="dxa" w:w="100"/>
+            </w:tcMar>
+          </w:tcPr>
+          <w:p>
+            <w:r>
+              <w:t xml:space="preserve">Réseaux routés</w:t>
+            </w:r>
+          </w:p>
+        </w:tc>
+        <w:tc>
+          <w:tcPr>
+            <w:tcW w:type="dxa" w:w="8330"/>
+            <w:tcBorders>
+              <w:top w:val="single" w:color="999999" w:sz="4"/>
+              <w:left w:val="single" w:color="999999" w:sz="4"/>
+              <w:bottom w:val="single" w:color="999999" w:sz="4"/>
+              <w:right w:val="single" w:color="999999" w:sz="4"/>
+            </w:tcBorders>
+            <w:tcMar>
+              <w:top w:type="dxa" w:w="60"/>
+              <w:left w:type="dxa" w:w="100"/>
+              <w:bottom w:type="dxa" w:w="60"/>
+              <w:right w:type="dxa" w:w="100"/>
+            </w:tcMar>
+          </w:tcPr>
+          <w:p>
+            <w:r>
+              <w:t xml:space="preserve">16, aucune liaison ouverte</w:t>
+            </w:r>
+          </w:p>
+        </w:tc>
+      </w:tr>
+      <w:tr>
+        <w:trPr>
+          <w:tblHeader w:val="off"/>
+        </w:trPr>
+        <w:tc>
+          <w:tcPr>
+            <w:tcW w:type="dxa" w:w="1308"/>
+            <w:tcBorders>
+              <w:top w:val="single" w:color="999999" w:sz="4"/>
+              <w:left w:val="single" w:color="999999" w:sz="4"/>
+              <w:bottom w:val="single" w:color="999999" w:sz="4"/>
+              <w:right w:val="single" w:color="999999" w:sz="4"/>
+            </w:tcBorders>
+            <w:tcMar>
+              <w:top w:type="dxa" w:w="60"/>
+              <w:left w:type="dxa" w:w="100"/>
+              <w:bottom w:type="dxa" w:w="60"/>
+              <w:right w:type="dxa" w:w="100"/>
+            </w:tcMar>
+          </w:tcPr>
+          <w:p>
+            <w:r>
+              <w:t xml:space="preserve">Largeurs</w:t>
+            </w:r>
+          </w:p>
+        </w:tc>
+        <w:tc>
+          <w:tcPr>
+            <w:tcW w:type="dxa" w:w="8330"/>
+            <w:tcBorders>
+              <w:top w:val="single" w:color="999999" w:sz="4"/>
+              <w:left w:val="single" w:color="999999" w:sz="4"/>
+              <w:bottom w:val="single" w:color="999999" w:sz="4"/>
+              <w:right w:val="single" w:color="999999" w:sz="4"/>
+            </w:tcBorders>
+            <w:tcMar>
+              <w:top w:type="dxa" w:w="60"/>
+              <w:left w:type="dxa" w:w="100"/>
+              <w:bottom w:type="dxa" w:w="60"/>
+              <w:right w:type="dxa" w:w="100"/>
+            </w:tcMar>
+          </w:tcPr>
+          <w:p>
+            <w:r>
+              <w:t xml:space="preserve">puissance 1,0 mm, </w:t>
+            </w:r>
+            <w:r>
+              <w:rPr>
+                <w:rFonts w:ascii="Consolas" w:cs="Consolas" w:eastAsia="Consolas" w:hAnsi="Consolas"/>
+                <w:sz w:val="19"/>
+                <w:szCs w:val="19"/>
+              </w:rPr>
+              <w:t xml:space="preserve">3V3</w:t>
+            </w:r>
+            <w:r>
+              <w:t xml:space="preserve"> 0,6 mm, signaux 0,4 mm</w:t>
+            </w:r>
+          </w:p>
+        </w:tc>
+      </w:tr>
+      <w:tr>
+        <w:trPr>
+          <w:tblHeader w:val="off"/>
+        </w:trPr>
+        <w:tc>
+          <w:tcPr>
+            <w:tcW w:type="dxa" w:w="1308"/>
+            <w:tcBorders>
+              <w:top w:val="single" w:color="999999" w:sz="4"/>
+              <w:left w:val="single" w:color="999999" w:sz="4"/>
+              <w:bottom w:val="single" w:color="999999" w:sz="4"/>
+              <w:right w:val="single" w:color="999999" w:sz="4"/>
+            </w:tcBorders>
+            <w:tcMar>
+              <w:top w:type="dxa" w:w="60"/>
+              <w:left w:type="dxa" w:w="100"/>
+              <w:bottom w:type="dxa" w:w="60"/>
+              <w:right w:type="dxa" w:w="100"/>
+            </w:tcMar>
+          </w:tcPr>
+          <w:p>
+            <w:r>
+              <w:t xml:space="preserve">Masse</w:t>
+            </w:r>
+          </w:p>
+        </w:tc>
+        <w:tc>
+          <w:tcPr>
+            <w:tcW w:type="dxa" w:w="8330"/>
+            <w:tcBorders>
+              <w:top w:val="single" w:color="999999" w:sz="4"/>
+              <w:left w:val="single" w:color="999999" w:sz="4"/>
+              <w:bottom w:val="single" w:color="999999" w:sz="4"/>
+              <w:right w:val="single" w:color="999999" w:sz="4"/>
+            </w:tcBorders>
+            <w:tcMar>
+              <w:top w:type="dxa" w:w="60"/>
+              <w:left w:type="dxa" w:w="100"/>
+              <w:bottom w:type="dxa" w:w="60"/>
+              <w:right w:type="dxa" w:w="100"/>
+            </w:tcMar>
+          </w:tcPr>
+          <w:p>
+            <w:r>
+              <w:t xml:space="preserve">plan </w:t>
+            </w:r>
+            <w:r>
+              <w:rPr>
+                <w:rFonts w:ascii="Consolas" w:cs="Consolas" w:eastAsia="Consolas" w:hAnsi="Consolas"/>
+                <w:sz w:val="19"/>
+                <w:szCs w:val="19"/>
+              </w:rPr>
+              <w:t xml:space="preserve">GND</w:t>
+            </w:r>
+            <w:r>
+              <w:t xml:space="preserve"> coulé sur les 2 faces, rayons thermiques sur les pastilles, 29 vias de couture</w:t>
+            </w:r>
+          </w:p>
+        </w:tc>
+      </w:tr>
+      <w:tr>
+        <w:trPr>
+          <w:tblHeader w:val="off"/>
+        </w:trPr>
+        <w:tc>
+          <w:tcPr>
+            <w:tcW w:type="dxa" w:w="1308"/>
+            <w:tcBorders>
+              <w:top w:val="single" w:color="999999" w:sz="4"/>
+              <w:left w:val="single" w:color="999999" w:sz="4"/>
+              <w:bottom w:val="single" w:color="999999" w:sz="4"/>
+              <w:right w:val="single" w:color="999999" w:sz="4"/>
+            </w:tcBorders>
+            <w:tcMar>
+              <w:top w:type="dxa" w:w="60"/>
+              <w:left w:type="dxa" w:w="100"/>
+              <w:bottom w:type="dxa" w:w="60"/>
+              <w:right w:type="dxa" w:w="100"/>
+            </w:tcMar>
+          </w:tcPr>
+          <w:p>
+            <w:r>
+              <w:t xml:space="preserve">Gouttes (teardrops)</w:t>
+            </w:r>
+          </w:p>
+        </w:tc>
+        <w:tc>
+          <w:tcPr>
+            <w:tcW w:type="dxa" w:w="8330"/>
+            <w:tcBorders>
+              <w:top w:val="single" w:color="999999" w:sz="4"/>
+              <w:left w:val="single" w:color="999999" w:sz="4"/>
+              <w:bottom w:val="single" w:color="999999" w:sz="4"/>
+              <w:right w:val="single" w:color="999999" w:sz="4"/>
+            </w:tcBorders>
+            <w:tcMar>
+              <w:top w:type="dxa" w:w="60"/>
+              <w:left w:type="dxa" w:w="100"/>
+              <w:bottom w:type="dxa" w:w="60"/>
+              <w:right w:type="dxa" w:w="100"/>
+            </w:tcMar>
+          </w:tcPr>
+          <w:p>
+            <w:r>
+              <w:t xml:space="preserve">posées sur toutes les pastilles et vias (Tools → Teardrop), plans recoulés ensuite (Tools → Copper Manager → Rebuild All)</w:t>
+            </w:r>
+          </w:p>
+        </w:tc>
+      </w:tr>
+      <w:tr>
+        <w:trPr>
+          <w:tblHeader w:val="off"/>
+        </w:trPr>
+        <w:tc>
+          <w:tcPr>
+            <w:tcW w:type="dxa" w:w="1308"/>
+            <w:tcBorders>
+              <w:top w:val="single" w:color="999999" w:sz="4"/>
+              <w:left w:val="single" w:color="999999" w:sz="4"/>
+              <w:bottom w:val="single" w:color="999999" w:sz="4"/>
+              <w:right w:val="single" w:color="999999" w:sz="4"/>
+            </w:tcBorders>
+            <w:tcMar>
+              <w:top w:type="dxa" w:w="60"/>
+              <w:left w:type="dxa" w:w="100"/>
+              <w:bottom w:type="dxa" w:w="60"/>
+              <w:right w:type="dxa" w:w="100"/>
+            </w:tcMar>
+          </w:tcPr>
+          <w:p>
+            <w:r>
+              <w:t xml:space="preserve">Contrôle des règles</w:t>
+            </w:r>
+          </w:p>
+        </w:tc>
+        <w:tc>
+          <w:tcPr>
+            <w:tcW w:type="dxa" w:w="8330"/>
+            <w:tcBorders>
+              <w:top w:val="single" w:color="999999" w:sz="4"/>
+              <w:left w:val="single" w:color="999999" w:sz="4"/>
+              <w:bottom w:val="single" w:color="999999" w:sz="4"/>
+              <w:right w:val="single" w:color="999999" w:sz="4"/>
+            </w:tcBorders>
+            <w:tcMar>
+              <w:top w:type="dxa" w:w="60"/>
+              <w:left w:type="dxa" w:w="100"/>
+              <w:bottom w:type="dxa" w:w="60"/>
+              <w:right w:type="dxa" w:w="100"/>
+            </w:tcMar>
+          </w:tcPr>
+          <w:p>
+            <w:r>
+              <w:rPr>
+                <w:b/>
+                <w:bCs/>
+              </w:rPr>
+              <w:t xml:space="preserve">0 erreur</w:t>
+            </w:r>
+            <w:r>
+              <w:t xml:space="preserve"> ; schéma et PCB identiques (60 liaisons)</w:t>
+            </w:r>
+          </w:p>
+        </w:tc>
+      </w:tr>
+    </w:tbl>
+    <w:p/>
+    <w:p>
+      <w:pPr>
+        <w:pStyle w:val="Heading2"/>
+        <w:keepNext/>
+      </w:pPr>
+      <w:r>
+        <w:t xml:space="preserve">8.4 Sérigraphie (face dessus)</w:t>
+      </w:r>
+    </w:p>
+    <w:p>
+      <w:pPr>
+        <w:pStyle w:val="ListParagraph"/>
+        <w:numPr>
+          <w:ilvl w:val="0"/>
+          <w:numId w:val="2"/>
+        </w:numPr>
+      </w:pPr>
+      <w:r>
+        <w:t xml:space="preserve">Titre : « Noeud Chauffage Sdb » et « V 1.0 - Octobre 2026 ».</w:t>
+      </w:r>
+    </w:p>
+    <w:p>
+      <w:pPr>
+        <w:pStyle w:val="ListParagraph"/>
+        <w:numPr>
+          <w:ilvl w:val="0"/>
+          <w:numId w:val="2"/>
+        </w:numPr>
+      </w:pPr>
+      <w:r>
+        <w:t xml:space="preserve">Prises : « 12 V » (J1, broches + et −), « LED IR » (J6, broches + et −), « MICRO » (J5, broches MICRO, GND, 3V3 de gauche à droite).</w:t>
+      </w:r>
+    </w:p>
+    <w:p>
+      <w:pPr>
+        <w:pStyle w:val="ListParagraph"/>
+        <w:numPr>
+          <w:ilvl w:val="0"/>
+          <w:numId w:val="2"/>
+        </w:numPr>
+      </w:pPr>
+      <w:r>
+        <w:t xml:space="preserve">Cavaliers de mesure : « I 5V » (JP1, courant total 5 V) et « I IR » (JP2, courant des LED IR) ; « I » = intensité.</w:t>
+      </w:r>
+    </w:p>
+    <w:p>
+      <w:pPr>
+        <w:pStyle w:val="ListParagraph"/>
+        <w:numPr>
+          <w:ilvl w:val="0"/>
+          <w:numId w:val="2"/>
+        </w:numPr>
+      </w:pPr>
+      <w:r>
+        <w:t xml:space="preserve">Points de test : V12, +5V, 3V3, MICRO, IR_K, GND (à côté des repères TP1 à TP6).</w:t>
+      </w:r>
+    </w:p>
+    <w:p>
+      <w:pPr>
+        <w:pStyle w:val="ListParagraph"/>
+        <w:numPr>
+          <w:ilvl w:val="0"/>
+          <w:numId w:val="2"/>
+        </w:numPr>
+      </w:pPr>
+      <w:r>
+        <w:t xml:space="preserve">Modules : « XIAO ESP32-C3 » (A1) et « R-78E5.0-1.0 » (U1).</w:t>
+      </w:r>
+    </w:p>
+    <w:p>
+      <w:pPr>
+        <w:pStyle w:val="ListParagraph"/>
+        <w:numPr>
+          <w:ilvl w:val="0"/>
+          <w:numId w:val="2"/>
+        </w:numPr>
+      </w:pPr>
+      <w:r>
+        <w:t xml:space="preserve">Contrôle : aucun texte sur une pastille, un via ou un trou ; hauteur mini 0,81 mm (noms des broches de J5).</w:t>
+      </w:r>
+    </w:p>
+    <w:p>
+      <w:pPr>
+        <w:pStyle w:val="Heading2"/>
+        <w:keepNext/>
+      </w:pPr>
+      <w:r>
+        <w:t xml:space="preserve">8.5 Fiches personnelles utilisées</w:t>
+      </w:r>
+    </w:p>
+    <w:tbl>
+      <w:tblPr>
+        <w:tblW w:type="dxa" w:w="9638"/>
+        <w:tblBorders>
+          <w:top w:val="single" w:color="auto" w:sz="4"/>
+          <w:left w:val="single" w:color="auto" w:sz="4"/>
+          <w:bottom w:val="single" w:color="auto" w:sz="4"/>
+          <w:right w:val="single" w:color="auto" w:sz="4"/>
+          <w:insideH w:val="single" w:color="auto" w:sz="4"/>
+          <w:insideV w:val="single" w:color="auto" w:sz="4"/>
+        </w:tblBorders>
+      </w:tblPr>
+      <w:tblGrid>
+        <w:gridCol w:w="3726"/>
+        <w:gridCol w:w="567"/>
+        <w:gridCol w:w="5345"/>
+      </w:tblGrid>
+      <w:tr>
+        <w:trPr>
+          <w:tblHeader/>
+        </w:trPr>
+        <w:tc>
+          <w:tcPr>
+            <w:tcW w:type="dxa" w:w="3726"/>
+            <w:tcBorders>
+              <w:top w:val="single" w:color="999999" w:sz="4"/>
+              <w:left w:val="single" w:color="999999" w:sz="4"/>
+              <w:bottom w:val="single" w:color="999999" w:sz="4"/>
+              <w:right w:val="single" w:color="999999" w:sz="4"/>
+            </w:tcBorders>
+            <w:shd w:fill="D9E2F3" w:val="clear"/>
+            <w:tcMar>
+              <w:top w:type="dxa" w:w="60"/>
+              <w:left w:type="dxa" w:w="100"/>
+              <w:bottom w:type="dxa" w:w="60"/>
+              <w:right w:type="dxa" w:w="100"/>
+            </w:tcMar>
+          </w:tcPr>
+          <w:p>
+            <w:r>
+              <w:rPr>
+                <w:b/>
+                <w:bCs/>
+              </w:rPr>
+              <w:t xml:space="preserve">Fiche (bibliothèque perso)</w:t>
+            </w:r>
+          </w:p>
+        </w:tc>
+        <w:tc>
+          <w:tcPr>
+            <w:tcW w:type="dxa" w:w="567"/>
+            <w:tcBorders>
+              <w:top w:val="single" w:color="999999" w:sz="4"/>
+              <w:left w:val="single" w:color="999999" w:sz="4"/>
+              <w:bottom w:val="single" w:color="999999" w:sz="4"/>
+              <w:right w:val="single" w:color="999999" w:sz="4"/>
+            </w:tcBorders>
+            <w:shd w:fill="D9E2F3" w:val="clear"/>
+            <w:tcMar>
+              <w:top w:type="dxa" w:w="60"/>
+              <w:left w:type="dxa" w:w="100"/>
+              <w:bottom w:type="dxa" w:w="60"/>
+              <w:right w:type="dxa" w:w="100"/>
+            </w:tcMar>
+          </w:tcPr>
+          <w:p>
+            <w:r>
+              <w:rPr>
+                <w:b/>
+                <w:bCs/>
+              </w:rPr>
+              <w:t xml:space="preserve">Repères</w:t>
+            </w:r>
+          </w:p>
+        </w:tc>
+        <w:tc>
+          <w:tcPr>
+            <w:tcW w:type="dxa" w:w="5345"/>
+            <w:tcBorders>
+              <w:top w:val="single" w:color="999999" w:sz="4"/>
+              <w:left w:val="single" w:color="999999" w:sz="4"/>
+              <w:bottom w:val="single" w:color="999999" w:sz="4"/>
+              <w:right w:val="single" w:color="999999" w:sz="4"/>
+            </w:tcBorders>
+            <w:shd w:fill="D9E2F3" w:val="clear"/>
+            <w:tcMar>
+              <w:top w:type="dxa" w:w="60"/>
+              <w:left w:type="dxa" w:w="100"/>
+              <w:bottom w:type="dxa" w:w="60"/>
+              <w:right w:type="dxa" w:w="100"/>
+            </w:tcMar>
+          </w:tcPr>
+          <w:p>
+            <w:r>
+              <w:rPr>
+                <w:b/>
+                <w:bCs/>
+              </w:rPr>
+              <w:t xml:space="preserve">Pourquoi</w:t>
+            </w:r>
+          </w:p>
+        </w:tc>
+      </w:tr>
+      <w:tr>
+        <w:trPr>
+          <w:tblHeader w:val="off"/>
+        </w:trPr>
+        <w:tc>
+          <w:tcPr>
+            <w:tcW w:type="dxa" w:w="3726"/>
+            <w:tcBorders>
+              <w:top w:val="single" w:color="999999" w:sz="4"/>
+              <w:left w:val="single" w:color="999999" w:sz="4"/>
+              <w:bottom w:val="single" w:color="999999" w:sz="4"/>
+              <w:right w:val="single" w:color="999999" w:sz="4"/>
+            </w:tcBorders>
+            <w:tcMar>
+              <w:top w:type="dxa" w:w="60"/>
+              <w:left w:type="dxa" w:w="100"/>
+              <w:bottom w:type="dxa" w:w="60"/>
+              <w:right w:type="dxa" w:w="100"/>
+            </w:tcMar>
+          </w:tcPr>
+          <w:p>
+            <w:r>
+              <w:t xml:space="preserve">XIAO ESP32-C3 (THT)</w:t>
+            </w:r>
+          </w:p>
+        </w:tc>
+        <w:tc>
+          <w:tcPr>
+            <w:tcW w:type="dxa" w:w="567"/>
+            <w:tcBorders>
+              <w:top w:val="single" w:color="999999" w:sz="4"/>
+              <w:left w:val="single" w:color="999999" w:sz="4"/>
+              <w:bottom w:val="single" w:color="999999" w:sz="4"/>
+              <w:right w:val="single" w:color="999999" w:sz="4"/>
+            </w:tcBorders>
+            <w:tcMar>
+              <w:top w:type="dxa" w:w="60"/>
+              <w:left w:type="dxa" w:w="100"/>
+              <w:bottom w:type="dxa" w:w="60"/>
+              <w:right w:type="dxa" w:w="100"/>
+            </w:tcMar>
+          </w:tcPr>
+          <w:p>
+            <w:r>
+              <w:t xml:space="preserve">A1</w:t>
+            </w:r>
+          </w:p>
+        </w:tc>
+        <w:tc>
+          <w:tcPr>
+            <w:tcW w:type="dxa" w:w="5345"/>
+            <w:tcBorders>
+              <w:top w:val="single" w:color="999999" w:sz="4"/>
+              <w:left w:val="single" w:color="999999" w:sz="4"/>
+              <w:bottom w:val="single" w:color="999999" w:sz="4"/>
+              <w:right w:val="single" w:color="999999" w:sz="4"/>
+            </w:tcBorders>
+            <w:tcMar>
+              <w:top w:type="dxa" w:w="60"/>
+              <w:left w:type="dxa" w:w="100"/>
+              <w:bottom w:type="dxa" w:w="60"/>
+              <w:right w:type="dxa" w:w="100"/>
+            </w:tcMar>
+          </w:tcPr>
+          <w:p>
+            <w:r>
+              <w:t xml:space="preserve">barrettes femelles, pattes numérotées 1–14, pastilles 1,8 mm</w:t>
+            </w:r>
+          </w:p>
+        </w:tc>
+      </w:tr>
+      <w:tr>
+        <w:trPr>
+          <w:tblHeader w:val="off"/>
+        </w:trPr>
+        <w:tc>
+          <w:tcPr>
+            <w:tcW w:type="dxa" w:w="3726"/>
+            <w:tcBorders>
+              <w:top w:val="single" w:color="999999" w:sz="4"/>
+              <w:left w:val="single" w:color="999999" w:sz="4"/>
+              <w:bottom w:val="single" w:color="999999" w:sz="4"/>
+              <w:right w:val="single" w:color="999999" w:sz="4"/>
+            </w:tcBorders>
+            <w:tcMar>
+              <w:top w:type="dxa" w:w="60"/>
+              <w:left w:type="dxa" w:w="100"/>
+              <w:bottom w:type="dxa" w:w="60"/>
+              <w:right w:type="dxa" w:w="100"/>
+            </w:tcMar>
+          </w:tcPr>
+          <w:p>
+            <w:r>
+              <w:t xml:space="preserve">Bornier XY301V 2P pas 5,0 agrandi (THT)</w:t>
+            </w:r>
+          </w:p>
+        </w:tc>
+        <w:tc>
+          <w:tcPr>
+            <w:tcW w:type="dxa" w:w="567"/>
+            <w:tcBorders>
+              <w:top w:val="single" w:color="999999" w:sz="4"/>
+              <w:left w:val="single" w:color="999999" w:sz="4"/>
+              <w:bottom w:val="single" w:color="999999" w:sz="4"/>
+              <w:right w:val="single" w:color="999999" w:sz="4"/>
+            </w:tcBorders>
+            <w:tcMar>
+              <w:top w:type="dxa" w:w="60"/>
+              <w:left w:type="dxa" w:w="100"/>
+              <w:bottom w:type="dxa" w:w="60"/>
+              <w:right w:type="dxa" w:w="100"/>
+            </w:tcMar>
+          </w:tcPr>
+          <w:p>
+            <w:r>
+              <w:t xml:space="preserve">J1</w:t>
+            </w:r>
+          </w:p>
+        </w:tc>
+        <w:tc>
+          <w:tcPr>
+            <w:tcW w:type="dxa" w:w="5345"/>
+            <w:tcBorders>
+              <w:top w:val="single" w:color="999999" w:sz="4"/>
+              <w:left w:val="single" w:color="999999" w:sz="4"/>
+              <w:bottom w:val="single" w:color="999999" w:sz="4"/>
+              <w:right w:val="single" w:color="999999" w:sz="4"/>
+            </w:tcBorders>
+            <w:tcMar>
+              <w:top w:type="dxa" w:w="60"/>
+              <w:left w:type="dxa" w:w="100"/>
+              <w:bottom w:type="dxa" w:w="60"/>
+              <w:right w:type="dxa" w:w="100"/>
+            </w:tcMar>
+          </w:tcPr>
+          <w:p>
+            <w:r>
+              <w:t xml:space="preserve">couronne agrandie (pastille 2,4 / trou 1,2)</w:t>
+            </w:r>
+          </w:p>
+        </w:tc>
+      </w:tr>
+      <w:tr>
+        <w:trPr>
+          <w:tblHeader w:val="off"/>
+        </w:trPr>
+        <w:tc>
+          <w:tcPr>
+            <w:tcW w:type="dxa" w:w="3726"/>
+            <w:tcBorders>
+              <w:top w:val="single" w:color="999999" w:sz="4"/>
+              <w:left w:val="single" w:color="999999" w:sz="4"/>
+              <w:bottom w:val="single" w:color="999999" w:sz="4"/>
+              <w:right w:val="single" w:color="999999" w:sz="4"/>
+            </w:tcBorders>
+            <w:tcMar>
+              <w:top w:type="dxa" w:w="60"/>
+              <w:left w:type="dxa" w:w="100"/>
+              <w:bottom w:type="dxa" w:w="60"/>
+              <w:right w:type="dxa" w:w="100"/>
+            </w:tcMar>
+          </w:tcPr>
+          <w:p>
+            <w:r>
+              <w:t xml:space="preserve">2N2222A TO-92 pas 2,54 (THT)</w:t>
+            </w:r>
+          </w:p>
+        </w:tc>
+        <w:tc>
+          <w:tcPr>
+            <w:tcW w:type="dxa" w:w="567"/>
+            <w:tcBorders>
+              <w:top w:val="single" w:color="999999" w:sz="4"/>
+              <w:left w:val="single" w:color="999999" w:sz="4"/>
+              <w:bottom w:val="single" w:color="999999" w:sz="4"/>
+              <w:right w:val="single" w:color="999999" w:sz="4"/>
+            </w:tcBorders>
+            <w:tcMar>
+              <w:top w:type="dxa" w:w="60"/>
+              <w:left w:type="dxa" w:w="100"/>
+              <w:bottom w:type="dxa" w:w="60"/>
+              <w:right w:type="dxa" w:w="100"/>
+            </w:tcMar>
+          </w:tcPr>
+          <w:p>
+            <w:r>
+              <w:t xml:space="preserve">Q1</w:t>
+            </w:r>
+          </w:p>
+        </w:tc>
+        <w:tc>
+          <w:tcPr>
+            <w:tcW w:type="dxa" w:w="5345"/>
+            <w:tcBorders>
+              <w:top w:val="single" w:color="999999" w:sz="4"/>
+              <w:left w:val="single" w:color="999999" w:sz="4"/>
+              <w:bottom w:val="single" w:color="999999" w:sz="4"/>
+              <w:right w:val="single" w:color="999999" w:sz="4"/>
+            </w:tcBorders>
+            <w:tcMar>
+              <w:top w:type="dxa" w:w="60"/>
+              <w:left w:type="dxa" w:w="100"/>
+              <w:bottom w:type="dxa" w:w="60"/>
+              <w:right w:type="dxa" w:w="100"/>
+            </w:tcMar>
+          </w:tcPr>
+          <w:p>
+            <w:r>
+              <w:t xml:space="preserve">pattes écartées pour la soudure à la main (1 = E, pastille carrée)</w:t>
+            </w:r>
+          </w:p>
+        </w:tc>
+      </w:tr>
+      <w:tr>
+        <w:trPr>
+          <w:tblHeader w:val="off"/>
+        </w:trPr>
+        <w:tc>
+          <w:tcPr>
+            <w:tcW w:type="dxa" w:w="3726"/>
+            <w:tcBorders>
+              <w:top w:val="single" w:color="999999" w:sz="4"/>
+              <w:left w:val="single" w:color="999999" w:sz="4"/>
+              <w:bottom w:val="single" w:color="999999" w:sz="4"/>
+              <w:right w:val="single" w:color="999999" w:sz="4"/>
+            </w:tcBorders>
+            <w:tcMar>
+              <w:top w:type="dxa" w:w="60"/>
+              <w:left w:type="dxa" w:w="100"/>
+              <w:bottom w:type="dxa" w:w="60"/>
+              <w:right w:type="dxa" w:w="100"/>
+            </w:tcMar>
+          </w:tcPr>
+          <w:p>
+            <w:r>
+              <w:t xml:space="preserve">Résistance 1/4 W (THT)</w:t>
+            </w:r>
+          </w:p>
+        </w:tc>
+        <w:tc>
+          <w:tcPr>
+            <w:tcW w:type="dxa" w:w="567"/>
+            <w:tcBorders>
+              <w:top w:val="single" w:color="999999" w:sz="4"/>
+              <w:left w:val="single" w:color="999999" w:sz="4"/>
+              <w:bottom w:val="single" w:color="999999" w:sz="4"/>
+              <w:right w:val="single" w:color="999999" w:sz="4"/>
+            </w:tcBorders>
+            <w:tcMar>
+              <w:top w:type="dxa" w:w="60"/>
+              <w:left w:type="dxa" w:w="100"/>
+              <w:bottom w:type="dxa" w:w="60"/>
+              <w:right w:type="dxa" w:w="100"/>
+            </w:tcMar>
+          </w:tcPr>
+          <w:p>
+            <w:r>
+              <w:t xml:space="preserve">R1–R5</w:t>
+            </w:r>
+          </w:p>
+        </w:tc>
+        <w:tc>
+          <w:tcPr>
+            <w:tcW w:type="dxa" w:w="5345"/>
+            <w:tcBorders>
+              <w:top w:val="single" w:color="999999" w:sz="4"/>
+              <w:left w:val="single" w:color="999999" w:sz="4"/>
+              <w:bottom w:val="single" w:color="999999" w:sz="4"/>
+              <w:right w:val="single" w:color="999999" w:sz="4"/>
+            </w:tcBorders>
+            <w:tcMar>
+              <w:top w:type="dxa" w:w="60"/>
+              <w:left w:type="dxa" w:w="100"/>
+              <w:bottom w:type="dxa" w:w="60"/>
+              <w:right w:type="dxa" w:w="100"/>
+            </w:tcMar>
+          </w:tcPr>
+          <w:p>
+            <w:r>
+              <w:t xml:space="preserve">une seule empreinte pas 10,16 mm, pastille 1,8 mm</w:t>
+            </w:r>
+          </w:p>
+        </w:tc>
+      </w:tr>
+      <w:tr>
+        <w:trPr>
+          <w:tblHeader w:val="off"/>
+        </w:trPr>
+        <w:tc>
+          <w:tcPr>
+            <w:tcW w:type="dxa" w:w="3726"/>
+            <w:tcBorders>
+              <w:top w:val="single" w:color="999999" w:sz="4"/>
+              <w:left w:val="single" w:color="999999" w:sz="4"/>
+              <w:bottom w:val="single" w:color="999999" w:sz="4"/>
+              <w:right w:val="single" w:color="999999" w:sz="4"/>
+            </w:tcBorders>
+            <w:tcMar>
+              <w:top w:type="dxa" w:w="60"/>
+              <w:left w:type="dxa" w:w="100"/>
+              <w:bottom w:type="dxa" w:w="60"/>
+              <w:right w:type="dxa" w:w="100"/>
+            </w:tcMar>
+          </w:tcPr>
+          <w:p>
+            <w:r>
+              <w:t xml:space="preserve">Condensateur électrolytique D5 pas 2,0 (THT)</w:t>
+            </w:r>
+          </w:p>
+        </w:tc>
+        <w:tc>
+          <w:tcPr>
+            <w:tcW w:type="dxa" w:w="567"/>
+            <w:tcBorders>
+              <w:top w:val="single" w:color="999999" w:sz="4"/>
+              <w:left w:val="single" w:color="999999" w:sz="4"/>
+              <w:bottom w:val="single" w:color="999999" w:sz="4"/>
+              <w:right w:val="single" w:color="999999" w:sz="4"/>
+            </w:tcBorders>
+            <w:tcMar>
+              <w:top w:type="dxa" w:w="60"/>
+              <w:left w:type="dxa" w:w="100"/>
+              <w:bottom w:type="dxa" w:w="60"/>
+              <w:right w:type="dxa" w:w="100"/>
+            </w:tcMar>
+          </w:tcPr>
+          <w:p>
+            <w:r>
+              <w:t xml:space="preserve">C1, C8</w:t>
+            </w:r>
+          </w:p>
+        </w:tc>
+        <w:tc>
+          <w:tcPr>
+            <w:tcW w:type="dxa" w:w="5345"/>
+            <w:tcBorders>
+              <w:top w:val="single" w:color="999999" w:sz="4"/>
+              <w:left w:val="single" w:color="999999" w:sz="4"/>
+              <w:bottom w:val="single" w:color="999999" w:sz="4"/>
+              <w:right w:val="single" w:color="999999" w:sz="4"/>
+            </w:tcBorders>
+            <w:tcMar>
+              <w:top w:type="dxa" w:w="60"/>
+              <w:left w:type="dxa" w:w="100"/>
+              <w:bottom w:type="dxa" w:w="60"/>
+              <w:right w:type="dxa" w:w="100"/>
+            </w:tcMar>
+          </w:tcPr>
+          <w:p>
+            <w:r>
+              <w:t xml:space="preserve">couronne agrandie</w:t>
+            </w:r>
+          </w:p>
+        </w:tc>
+      </w:tr>
+      <w:tr>
+        <w:trPr>
+          <w:tblHeader w:val="off"/>
+        </w:trPr>
+        <w:tc>
+          <w:tcPr>
+            <w:tcW w:type="dxa" w:w="3726"/>
+            <w:tcBorders>
+              <w:top w:val="single" w:color="999999" w:sz="4"/>
+              <w:left w:val="single" w:color="999999" w:sz="4"/>
+              <w:bottom w:val="single" w:color="999999" w:sz="4"/>
+              <w:right w:val="single" w:color="999999" w:sz="4"/>
+            </w:tcBorders>
+            <w:tcMar>
+              <w:top w:type="dxa" w:w="60"/>
+              <w:left w:type="dxa" w:w="100"/>
+              <w:bottom w:type="dxa" w:w="60"/>
+              <w:right w:type="dxa" w:w="100"/>
+            </w:tcMar>
+          </w:tcPr>
+          <w:p>
+            <w:r>
+              <w:t xml:space="preserve">Condensateur électrolytique D6,3 pas 2,5 (THT)</w:t>
+            </w:r>
+          </w:p>
+        </w:tc>
+        <w:tc>
+          <w:tcPr>
+            <w:tcW w:type="dxa" w:w="567"/>
+            <w:tcBorders>
+              <w:top w:val="single" w:color="999999" w:sz="4"/>
+              <w:left w:val="single" w:color="999999" w:sz="4"/>
+              <w:bottom w:val="single" w:color="999999" w:sz="4"/>
+              <w:right w:val="single" w:color="999999" w:sz="4"/>
+            </w:tcBorders>
+            <w:tcMar>
+              <w:top w:type="dxa" w:w="60"/>
+              <w:left w:type="dxa" w:w="100"/>
+              <w:bottom w:type="dxa" w:w="60"/>
+              <w:right w:type="dxa" w:w="100"/>
+            </w:tcMar>
+          </w:tcPr>
+          <w:p>
+            <w:r>
+              <w:t xml:space="preserve">C6, C10</w:t>
+            </w:r>
+          </w:p>
+        </w:tc>
+        <w:tc>
+          <w:tcPr>
+            <w:tcW w:type="dxa" w:w="5345"/>
+            <w:tcBorders>
+              <w:top w:val="single" w:color="999999" w:sz="4"/>
+              <w:left w:val="single" w:color="999999" w:sz="4"/>
+              <w:bottom w:val="single" w:color="999999" w:sz="4"/>
+              <w:right w:val="single" w:color="999999" w:sz="4"/>
+            </w:tcBorders>
+            <w:tcMar>
+              <w:top w:type="dxa" w:w="60"/>
+              <w:left w:type="dxa" w:w="100"/>
+              <w:bottom w:type="dxa" w:w="60"/>
+              <w:right w:type="dxa" w:w="100"/>
+            </w:tcMar>
+          </w:tcPr>
+          <w:p>
+            <w:r>
+              <w:t xml:space="preserve">couronne agrandie</w:t>
+            </w:r>
+          </w:p>
+        </w:tc>
+      </w:tr>
+      <w:tr>
+        <w:trPr>
+          <w:tblHeader w:val="off"/>
+        </w:trPr>
+        <w:tc>
+          <w:tcPr>
+            <w:tcW w:type="dxa" w:w="3726"/>
+            <w:tcBorders>
+              <w:top w:val="single" w:color="999999" w:sz="4"/>
+              <w:left w:val="single" w:color="999999" w:sz="4"/>
+              <w:bottom w:val="single" w:color="999999" w:sz="4"/>
+              <w:right w:val="single" w:color="999999" w:sz="4"/>
+            </w:tcBorders>
+            <w:tcMar>
+              <w:top w:type="dxa" w:w="60"/>
+              <w:left w:type="dxa" w:w="100"/>
+              <w:bottom w:type="dxa" w:w="60"/>
+              <w:right w:type="dxa" w:w="100"/>
+            </w:tcMar>
+          </w:tcPr>
+          <w:p>
+            <w:r>
+              <w:t xml:space="preserve">LED 5 mm (THT)</w:t>
+            </w:r>
+          </w:p>
+        </w:tc>
+        <w:tc>
+          <w:tcPr>
+            <w:tcW w:type="dxa" w:w="567"/>
+            <w:tcBorders>
+              <w:top w:val="single" w:color="999999" w:sz="4"/>
+              <w:left w:val="single" w:color="999999" w:sz="4"/>
+              <w:bottom w:val="single" w:color="999999" w:sz="4"/>
+              <w:right w:val="single" w:color="999999" w:sz="4"/>
+            </w:tcBorders>
+            <w:tcMar>
+              <w:top w:type="dxa" w:w="60"/>
+              <w:left w:type="dxa" w:w="100"/>
+              <w:bottom w:type="dxa" w:w="60"/>
+              <w:right w:type="dxa" w:w="100"/>
+            </w:tcMar>
+          </w:tcPr>
+          <w:p>
+            <w:r>
+              <w:t xml:space="preserve">D6, D7</w:t>
+            </w:r>
+          </w:p>
+        </w:tc>
+        <w:tc>
+          <w:tcPr>
+            <w:tcW w:type="dxa" w:w="5345"/>
+            <w:tcBorders>
+              <w:top w:val="single" w:color="999999" w:sz="4"/>
+              <w:left w:val="single" w:color="999999" w:sz="4"/>
+              <w:bottom w:val="single" w:color="999999" w:sz="4"/>
+              <w:right w:val="single" w:color="999999" w:sz="4"/>
+            </w:tcBorders>
+            <w:tcMar>
+              <w:top w:type="dxa" w:w="60"/>
+              <w:left w:type="dxa" w:w="100"/>
+              <w:bottom w:type="dxa" w:w="60"/>
+              <w:right w:type="dxa" w:w="100"/>
+            </w:tcMar>
+          </w:tcPr>
+          <w:p>
+            <w:r>
+              <w:t xml:space="preserve">A = 1 sur les deux LED</w:t>
+            </w:r>
+          </w:p>
+        </w:tc>
+      </w:tr>
+      <w:tr>
+        <w:trPr>
+          <w:tblHeader w:val="off"/>
+        </w:trPr>
+        <w:tc>
+          <w:tcPr>
+            <w:tcW w:type="dxa" w:w="3726"/>
+            <w:tcBorders>
+              <w:top w:val="single" w:color="999999" w:sz="4"/>
+              <w:left w:val="single" w:color="999999" w:sz="4"/>
+              <w:bottom w:val="single" w:color="999999" w:sz="4"/>
+              <w:right w:val="single" w:color="999999" w:sz="4"/>
+            </w:tcBorders>
+            <w:tcMar>
+              <w:top w:type="dxa" w:w="60"/>
+              <w:left w:type="dxa" w:w="100"/>
+              <w:bottom w:type="dxa" w:w="60"/>
+              <w:right w:type="dxa" w:w="100"/>
+            </w:tcMar>
+          </w:tcPr>
+          <w:p>
+            <w:r>
+              <w:t xml:space="preserve">JST-XH 2P (THT) / JST-XH 3P (THT)</w:t>
+            </w:r>
+          </w:p>
+        </w:tc>
+        <w:tc>
+          <w:tcPr>
+            <w:tcW w:type="dxa" w:w="567"/>
+            <w:tcBorders>
+              <w:top w:val="single" w:color="999999" w:sz="4"/>
+              <w:left w:val="single" w:color="999999" w:sz="4"/>
+              <w:bottom w:val="single" w:color="999999" w:sz="4"/>
+              <w:right w:val="single" w:color="999999" w:sz="4"/>
+            </w:tcBorders>
+            <w:tcMar>
+              <w:top w:type="dxa" w:w="60"/>
+              <w:left w:type="dxa" w:w="100"/>
+              <w:bottom w:type="dxa" w:w="60"/>
+              <w:right w:type="dxa" w:w="100"/>
+            </w:tcMar>
+          </w:tcPr>
+          <w:p>
+            <w:r>
+              <w:t xml:space="preserve">J6 / J5</w:t>
+            </w:r>
+          </w:p>
+        </w:tc>
+        <w:tc>
+          <w:tcPr>
+            <w:tcW w:type="dxa" w:w="5345"/>
+            <w:tcBorders>
+              <w:top w:val="single" w:color="999999" w:sz="4"/>
+              <w:left w:val="single" w:color="999999" w:sz="4"/>
+              <w:bottom w:val="single" w:color="999999" w:sz="4"/>
+              <w:right w:val="single" w:color="999999" w:sz="4"/>
+            </w:tcBorders>
+            <w:tcMar>
+              <w:top w:type="dxa" w:w="60"/>
+              <w:left w:type="dxa" w:w="100"/>
+              <w:bottom w:type="dxa" w:w="60"/>
+              <w:right w:type="dxa" w:w="100"/>
+            </w:tcMar>
+          </w:tcPr>
+          <w:p>
+            <w:r>
+              <w:t xml:space="preserve">couronne agrandie</w:t>
+            </w:r>
+          </w:p>
+        </w:tc>
+      </w:tr>
+      <w:tr>
+        <w:trPr>
+          <w:tblHeader w:val="off"/>
+        </w:trPr>
+        <w:tc>
+          <w:tcPr>
+            <w:tcW w:type="dxa" w:w="3726"/>
+            <w:tcBorders>
+              <w:top w:val="single" w:color="999999" w:sz="4"/>
+              <w:left w:val="single" w:color="999999" w:sz="4"/>
+              <w:bottom w:val="single" w:color="999999" w:sz="4"/>
+              <w:right w:val="single" w:color="999999" w:sz="4"/>
+            </w:tcBorders>
+            <w:tcMar>
+              <w:top w:type="dxa" w:w="60"/>
+              <w:left w:type="dxa" w:w="100"/>
+              <w:bottom w:type="dxa" w:w="60"/>
+              <w:right w:type="dxa" w:w="100"/>
+            </w:tcMar>
+          </w:tcPr>
+          <w:p>
+            <w:r>
+              <w:t xml:space="preserve">Point de test (THT)</w:t>
+            </w:r>
+          </w:p>
+        </w:tc>
+        <w:tc>
+          <w:tcPr>
+            <w:tcW w:type="dxa" w:w="567"/>
+            <w:tcBorders>
+              <w:top w:val="single" w:color="999999" w:sz="4"/>
+              <w:left w:val="single" w:color="999999" w:sz="4"/>
+              <w:bottom w:val="single" w:color="999999" w:sz="4"/>
+              <w:right w:val="single" w:color="999999" w:sz="4"/>
+            </w:tcBorders>
+            <w:tcMar>
+              <w:top w:type="dxa" w:w="60"/>
+              <w:left w:type="dxa" w:w="100"/>
+              <w:bottom w:type="dxa" w:w="60"/>
+              <w:right w:type="dxa" w:w="100"/>
+            </w:tcMar>
+          </w:tcPr>
+          <w:p>
+            <w:r>
+              <w:t xml:space="preserve">TP1–TP6</w:t>
+            </w:r>
+          </w:p>
+        </w:tc>
+        <w:tc>
+          <w:tcPr>
+            <w:tcW w:type="dxa" w:w="5345"/>
+            <w:tcBorders>
+              <w:top w:val="single" w:color="999999" w:sz="4"/>
+              <w:left w:val="single" w:color="999999" w:sz="4"/>
+              <w:bottom w:val="single" w:color="999999" w:sz="4"/>
+              <w:right w:val="single" w:color="999999" w:sz="4"/>
+            </w:tcBorders>
+            <w:tcMar>
+              <w:top w:type="dxa" w:w="60"/>
+              <w:left w:type="dxa" w:w="100"/>
+              <w:bottom w:type="dxa" w:w="60"/>
+              <w:right w:type="dxa" w:w="100"/>
+            </w:tcMar>
+          </w:tcPr>
+          <w:p>
+            <w:r>
+              <w:t xml:space="preserve">couronne agrandie</w:t>
+            </w:r>
+          </w:p>
+        </w:tc>
+      </w:tr>
+    </w:tbl>
+    <w:p/>
+    <w:p>
+      <w:pPr>
+        <w:pStyle w:val="Heading2"/>
+        <w:keepNext/>
+      </w:pPr>
+      <w:r>
+        <w:t xml:space="preserve">8.6 Reste à faire</w:t>
+      </w:r>
+    </w:p>
+    <w:p>
+      <w:pPr>
+        <w:pStyle w:val="ListParagraph"/>
+        <w:numPr>
+          <w:ilvl w:val="0"/>
+          <w:numId w:val="2"/>
+        </w:numPr>
+      </w:pPr>
+      <w:r>
+        <w:t xml:space="preserve">☑ Export </w:t>
       </w:r>
       <w:r>
         <w:rPr>
@@ -6624,10 +8444,10 @@
           <w:sz w:val="19"/>
           <w:szCs w:val="19"/>
         </w:rPr>
-        <w:t xml:space="preserve">V12_J</w:t>
-      </w:r>
-      <w:r>
-        <w:t xml:space="preserve">, </w:t>
+        <w:t xml:space="preserve">.epro2</w:t>
+      </w:r>
+      <w:r>
+        <w:t xml:space="preserve"> dans </w:t>
       </w:r>
       <w:r>
         <w:rPr>
@@ -6635,10 +8455,22 @@
           <w:sz w:val="19"/>
           <w:szCs w:val="19"/>
         </w:rPr>
-        <w:t xml:space="preserve">V12</w:t>
-      </w:r>
-      <w:r>
-        <w:t xml:space="preserve">, </w:t>
+        <w:t xml:space="preserve">pcb/</w:t>
+      </w:r>
+      <w:r>
+        <w:t xml:space="preserve"> (Fichier → Enregistrer sous → Project save as local → epro2 V3).</w:t>
+      </w:r>
+    </w:p>
+    <w:p>
+      <w:pPr>
+        <w:pStyle w:val="ListParagraph"/>
+        <w:numPr>
+          <w:ilvl w:val="0"/>
+          <w:numId w:val="2"/>
+        </w:numPr>
+      </w:pPr>
+      <w:r>
+        <w:t xml:space="preserve">☐ Commit (procédure NAS de Pilotage_Maison, sans </w:t>
       </w:r>
       <w:r>
         <w:rPr>
@@ -6646,87 +8478,34 @@
           <w:sz w:val="19"/>
           <w:szCs w:val="19"/>
         </w:rPr>
-        <w:t xml:space="preserve">5V_REG</w:t>
-      </w:r>
-      <w:r>
-        <w:t xml:space="preserve">, </w:t>
-      </w:r>
-      <w:r>
-        <w:rPr>
-          <w:rFonts w:ascii="Consolas" w:cs="Consolas" w:eastAsia="Consolas" w:hAnsi="Consolas"/>
-          <w:sz w:val="19"/>
-          <w:szCs w:val="19"/>
-        </w:rPr>
-        <w:t xml:space="preserve">+5V</w:t>
-      </w:r>
-      <w:r>
-        <w:t xml:space="preserve">, </w:t>
-      </w:r>
-      <w:r>
-        <w:rPr>
-          <w:rFonts w:ascii="Consolas" w:cs="Consolas" w:eastAsia="Consolas" w:hAnsi="Consolas"/>
-          <w:sz w:val="19"/>
-          <w:szCs w:val="19"/>
-        </w:rPr>
-        <w:t xml:space="preserve">5V_CARTE</w:t>
-      </w:r>
-      <w:r>
-        <w:t xml:space="preserve">, </w:t>
-      </w:r>
-      <w:r>
-        <w:rPr>
-          <w:rFonts w:ascii="Consolas" w:cs="Consolas" w:eastAsia="Consolas" w:hAnsi="Consolas"/>
-          <w:sz w:val="19"/>
-          <w:szCs w:val="19"/>
-        </w:rPr>
-        <w:t xml:space="preserve">GND</w:t>
-      </w:r>
-      <w:r>
-        <w:t xml:space="preserve">, </w:t>
-      </w:r>
-      <w:r>
-        <w:rPr>
-          <w:rFonts w:ascii="Consolas" w:cs="Consolas" w:eastAsia="Consolas" w:hAnsi="Consolas"/>
-          <w:sz w:val="19"/>
-          <w:szCs w:val="19"/>
-        </w:rPr>
-        <w:t xml:space="preserve">IR_V</w:t>
-      </w:r>
-      <w:r>
-        <w:t xml:space="preserve">, </w:t>
-      </w:r>
-      <w:r>
-        <w:rPr>
-          <w:rFonts w:ascii="Consolas" w:cs="Consolas" w:eastAsia="Consolas" w:hAnsi="Consolas"/>
-          <w:sz w:val="19"/>
-          <w:szCs w:val="19"/>
-        </w:rPr>
-        <w:t xml:space="preserve">IR_A</w:t>
-      </w:r>
-      <w:r>
-        <w:t xml:space="preserve">, </w:t>
-      </w:r>
-      <w:r>
-        <w:rPr>
-          <w:rFonts w:ascii="Consolas" w:cs="Consolas" w:eastAsia="Consolas" w:hAnsi="Consolas"/>
-          <w:sz w:val="19"/>
-          <w:szCs w:val="19"/>
-        </w:rPr>
-        <w:t xml:space="preserve">IR_K</w:t>
-      </w:r>
-      <w:r>
-        <w:t xml:space="preserve">) et ALIM_3V3 (</w:t>
-      </w:r>
-      <w:r>
-        <w:rPr>
-          <w:rFonts w:ascii="Consolas" w:cs="Consolas" w:eastAsia="Consolas" w:hAnsi="Consolas"/>
-          <w:sz w:val="19"/>
-          <w:szCs w:val="19"/>
-        </w:rPr>
-        <w:t xml:space="preserve">3V3</w:t>
-      </w:r>
-      <w:r>
-        <w:t xml:space="preserve">), connecteurs « vers … ».</w:t>
+        <w:t xml:space="preserve">global.h</w:t>
+      </w:r>
+      <w:r>
+        <w:t xml:space="preserve">).</w:t>
+      </w:r>
+    </w:p>
+    <w:p>
+      <w:pPr>
+        <w:pStyle w:val="ListParagraph"/>
+        <w:numPr>
+          <w:ilvl w:val="0"/>
+          <w:numId w:val="2"/>
+        </w:numPr>
+      </w:pPr>
+      <w:r>
+        <w:t xml:space="preserve">☐ Commande JLCPCB (fichiers de fabrication depuis EasyEDA ; options de commande à choisir).</w:t>
+      </w:r>
+    </w:p>
+    <w:p>
+      <w:pPr>
+        <w:pStyle w:val="ListParagraph"/>
+        <w:numPr>
+          <w:ilvl w:val="0"/>
+          <w:numId w:val="2"/>
+        </w:numPr>
+      </w:pPr>
+      <w:r>
+        <w:t xml:space="preserve">☐ À réception : mesures du § 7 ; tracé du boîtier imprimé.</w:t>
       </w:r>
     </w:p>
     <w:p>
@@ -6736,6 +8515,14 @@
       </w:pPr>
       <w:r>
         <w:t xml:space="preserve">9. Pièces LCSC (références EasyEDA)</w:t>
+      </w:r>
+    </w:p>
+    <w:p>
+      <w:pPr>
+        <w:spacing w:after="120"/>
+      </w:pPr>
+      <w:r>
+        <w:t xml:space="preserve">Pièces choisies au départ ; les empreintes réellement posées sont celles des fiches personnelles du § 8.5 quand elles existent.</w:t>
       </w:r>
     </w:p>
     <w:tbl>

</xml_diff>